<commit_message>
cambio en el orden del cuadro de matriz de riesgo
</commit_message>
<xml_diff>
--- a/Fase 1/Evidencias Proyecto/Matriz de riesgo.docx
+++ b/Fase 1/Evidencias Proyecto/Matriz de riesgo.docx
@@ -10,8 +10,6 @@
           <w:sz w:val="24"/>
         </w:rPr>
       </w:pPr>
-      <w:bookmarkStart w:id="0" w:name="_GoBack"/>
-      <w:bookmarkEnd w:id="0"/>
       <w:r>
         <w:rPr>
           <w:b/>
@@ -2690,8 +2688,7 @@
     </w:p>
     <w:tbl>
       <w:tblPr>
-        <w:tblW w:w="6567" w:type="dxa"/>
-        <w:tblInd w:w="1143" w:type="dxa"/>
+        <w:tblW w:w="7758" w:type="dxa"/>
         <w:tblCellMar>
           <w:left w:w="70" w:type="dxa"/>
           <w:right w:w="70" w:type="dxa"/>
@@ -2699,19 +2696,19 @@
         <w:tblLook w:val="04A0" w:firstRow="1" w:lastRow="0" w:firstColumn="1" w:lastColumn="0" w:noHBand="0" w:noVBand="1"/>
       </w:tblPr>
       <w:tblGrid>
-        <w:gridCol w:w="547"/>
-        <w:gridCol w:w="980"/>
-        <w:gridCol w:w="3020"/>
-        <w:gridCol w:w="1020"/>
-        <w:gridCol w:w="1000"/>
+        <w:gridCol w:w="1043"/>
+        <w:gridCol w:w="1869"/>
+        <w:gridCol w:w="1526"/>
+        <w:gridCol w:w="1869"/>
+        <w:gridCol w:w="1451"/>
       </w:tblGrid>
       <w:tr>
         <w:trPr>
-          <w:trHeight w:val="288"/>
+          <w:trHeight w:val="551"/>
         </w:trPr>
         <w:tc>
           <w:tcPr>
-            <w:tcW w:w="547" w:type="dxa"/>
+            <w:tcW w:w="1043" w:type="dxa"/>
             <w:vMerge w:val="restart"/>
             <w:tcBorders>
               <w:top w:val="nil"/>
@@ -2755,7 +2752,7 @@
         </w:tc>
         <w:tc>
           <w:tcPr>
-            <w:tcW w:w="980" w:type="dxa"/>
+            <w:tcW w:w="1869" w:type="dxa"/>
             <w:tcBorders>
               <w:top w:val="single" w:sz="4" w:space="0" w:color="auto"/>
               <w:left w:val="nil"/>
@@ -2786,21 +2783,20 @@
                 <w:color w:val="000000"/>
                 <w:lang w:eastAsia="es-CL"/>
               </w:rPr>
-              <w:t>Baja (1)</w:t>
-            </w:r>
-          </w:p>
-        </w:tc>
-        <w:tc>
-          <w:tcPr>
-            <w:tcW w:w="3020" w:type="dxa"/>
+              <w:t>Alta (3)</w:t>
+            </w:r>
+          </w:p>
+        </w:tc>
+        <w:tc>
+          <w:tcPr>
+            <w:tcW w:w="1526" w:type="dxa"/>
             <w:tcBorders>
               <w:top w:val="single" w:sz="4" w:space="0" w:color="auto"/>
               <w:left w:val="nil"/>
               <w:bottom w:val="single" w:sz="4" w:space="0" w:color="auto"/>
               <w:right w:val="single" w:sz="4" w:space="0" w:color="auto"/>
             </w:tcBorders>
-            <w:shd w:val="clear" w:color="C6EFCE" w:fill="C6EFCE"/>
-            <w:noWrap/>
+            <w:shd w:val="clear" w:color="FFEB9C" w:fill="FFEB9C"/>
             <w:vAlign w:val="center"/>
             <w:hideMark/>
           </w:tcPr>
@@ -2830,14 +2826,14 @@
         </w:tc>
         <w:tc>
           <w:tcPr>
-            <w:tcW w:w="1020" w:type="dxa"/>
+            <w:tcW w:w="1869" w:type="dxa"/>
             <w:tcBorders>
               <w:top w:val="single" w:sz="4" w:space="0" w:color="auto"/>
               <w:left w:val="nil"/>
               <w:bottom w:val="single" w:sz="4" w:space="0" w:color="auto"/>
               <w:right w:val="single" w:sz="4" w:space="0" w:color="auto"/>
             </w:tcBorders>
-            <w:shd w:val="clear" w:color="C6EFCE" w:fill="C6EFCE"/>
+            <w:shd w:val="clear" w:color="FFC7CE" w:fill="FFC7CE"/>
             <w:noWrap/>
             <w:vAlign w:val="center"/>
             <w:hideMark/>
@@ -2862,20 +2858,20 @@
                 <w:color w:val="000000"/>
                 <w:lang w:eastAsia="es-CL"/>
               </w:rPr>
-              <w:t> </w:t>
-            </w:r>
-          </w:p>
-        </w:tc>
-        <w:tc>
-          <w:tcPr>
-            <w:tcW w:w="1000" w:type="dxa"/>
+              <w:t>1, 2, 7</w:t>
+            </w:r>
+          </w:p>
+        </w:tc>
+        <w:tc>
+          <w:tcPr>
+            <w:tcW w:w="1450" w:type="dxa"/>
             <w:tcBorders>
               <w:top w:val="single" w:sz="4" w:space="0" w:color="auto"/>
               <w:left w:val="nil"/>
               <w:bottom w:val="single" w:sz="4" w:space="0" w:color="auto"/>
               <w:right w:val="single" w:sz="4" w:space="0" w:color="auto"/>
             </w:tcBorders>
-            <w:shd w:val="clear" w:color="FFEB9C" w:fill="FFEB9C"/>
+            <w:shd w:val="clear" w:color="FFC7CE" w:fill="FFC7CE"/>
             <w:noWrap/>
             <w:vAlign w:val="center"/>
             <w:hideMark/>
@@ -2907,11 +2903,11 @@
       </w:tr>
       <w:tr>
         <w:trPr>
-          <w:trHeight w:val="576"/>
+          <w:trHeight w:val="616"/>
         </w:trPr>
         <w:tc>
           <w:tcPr>
-            <w:tcW w:w="547" w:type="dxa"/>
+            <w:tcW w:w="1043" w:type="dxa"/>
             <w:vMerge/>
             <w:tcBorders>
               <w:top w:val="nil"/>
@@ -2939,7 +2935,7 @@
         </w:tc>
         <w:tc>
           <w:tcPr>
-            <w:tcW w:w="980" w:type="dxa"/>
+            <w:tcW w:w="1869" w:type="dxa"/>
             <w:tcBorders>
               <w:top w:val="nil"/>
               <w:left w:val="nil"/>
@@ -2976,7 +2972,7 @@
         </w:tc>
         <w:tc>
           <w:tcPr>
-            <w:tcW w:w="3020" w:type="dxa"/>
+            <w:tcW w:w="1526" w:type="dxa"/>
             <w:tcBorders>
               <w:top w:val="nil"/>
               <w:left w:val="nil"/>
@@ -3014,7 +3010,7 @@
         </w:tc>
         <w:tc>
           <w:tcPr>
-            <w:tcW w:w="1020" w:type="dxa"/>
+            <w:tcW w:w="1869" w:type="dxa"/>
             <w:tcBorders>
               <w:top w:val="nil"/>
               <w:left w:val="nil"/>
@@ -3045,24 +3041,13 @@
                 <w:color w:val="000000"/>
                 <w:lang w:eastAsia="es-CL"/>
               </w:rPr>
-              <w:t>3</w:t>
-            </w:r>
-            <w:r>
-              <w:rPr>
-                <w:rFonts w:ascii="Calibri" w:eastAsia="Times New Roman" w:hAnsi="Calibri" w:cs="Calibri"/>
-                <w:b/>
-                <w:bCs/>
-                <w:color w:val="000000"/>
-                <w:lang w:eastAsia="es-CL"/>
-              </w:rPr>
-              <w:br/>
-              <w:t>6</w:t>
-            </w:r>
-          </w:p>
-        </w:tc>
-        <w:tc>
-          <w:tcPr>
-            <w:tcW w:w="1000" w:type="dxa"/>
+              <w:t>3, 6</w:t>
+            </w:r>
+          </w:p>
+        </w:tc>
+        <w:tc>
+          <w:tcPr>
+            <w:tcW w:w="1450" w:type="dxa"/>
             <w:tcBorders>
               <w:top w:val="nil"/>
               <w:left w:val="nil"/>
@@ -3101,11 +3086,11 @@
       </w:tr>
       <w:tr>
         <w:trPr>
-          <w:trHeight w:val="576"/>
+          <w:trHeight w:val="648"/>
         </w:trPr>
         <w:tc>
           <w:tcPr>
-            <w:tcW w:w="547" w:type="dxa"/>
+            <w:tcW w:w="1043" w:type="dxa"/>
             <w:vMerge/>
             <w:tcBorders>
               <w:top w:val="nil"/>
@@ -3133,7 +3118,7 @@
         </w:tc>
         <w:tc>
           <w:tcPr>
-            <w:tcW w:w="980" w:type="dxa"/>
+            <w:tcW w:w="1869" w:type="dxa"/>
             <w:tcBorders>
               <w:top w:val="nil"/>
               <w:left w:val="nil"/>
@@ -3164,13 +3149,89 @@
                 <w:color w:val="000000"/>
                 <w:lang w:eastAsia="es-CL"/>
               </w:rPr>
-              <w:t>Alta (3)</w:t>
-            </w:r>
-          </w:p>
-        </w:tc>
-        <w:tc>
-          <w:tcPr>
-            <w:tcW w:w="3020" w:type="dxa"/>
+              <w:t>Baja (1)</w:t>
+            </w:r>
+          </w:p>
+        </w:tc>
+        <w:tc>
+          <w:tcPr>
+            <w:tcW w:w="1526" w:type="dxa"/>
+            <w:tcBorders>
+              <w:top w:val="nil"/>
+              <w:left w:val="nil"/>
+              <w:bottom w:val="single" w:sz="4" w:space="0" w:color="auto"/>
+              <w:right w:val="single" w:sz="4" w:space="0" w:color="auto"/>
+            </w:tcBorders>
+            <w:shd w:val="clear" w:color="C6EFCE" w:fill="C6EFCE"/>
+            <w:noWrap/>
+            <w:vAlign w:val="center"/>
+            <w:hideMark/>
+          </w:tcPr>
+          <w:p>
+            <w:pPr>
+              <w:spacing w:after="0" w:line="240" w:lineRule="auto"/>
+              <w:jc w:val="center"/>
+              <w:rPr>
+                <w:rFonts w:ascii="Calibri" w:eastAsia="Times New Roman" w:hAnsi="Calibri" w:cs="Calibri"/>
+                <w:b/>
+                <w:bCs/>
+                <w:color w:val="000000"/>
+                <w:lang w:eastAsia="es-CL"/>
+              </w:rPr>
+            </w:pPr>
+            <w:r>
+              <w:rPr>
+                <w:rFonts w:ascii="Calibri" w:eastAsia="Times New Roman" w:hAnsi="Calibri" w:cs="Calibri"/>
+                <w:b/>
+                <w:bCs/>
+                <w:color w:val="000000"/>
+                <w:lang w:eastAsia="es-CL"/>
+              </w:rPr>
+              <w:t>4, 5</w:t>
+            </w:r>
+          </w:p>
+        </w:tc>
+        <w:tc>
+          <w:tcPr>
+            <w:tcW w:w="1869" w:type="dxa"/>
+            <w:tcBorders>
+              <w:top w:val="nil"/>
+              <w:left w:val="nil"/>
+              <w:bottom w:val="single" w:sz="4" w:space="0" w:color="auto"/>
+              <w:right w:val="single" w:sz="4" w:space="0" w:color="auto"/>
+            </w:tcBorders>
+            <w:shd w:val="clear" w:color="C6EFCE" w:fill="C6EFCE"/>
+            <w:noWrap/>
+            <w:vAlign w:val="center"/>
+            <w:hideMark/>
+          </w:tcPr>
+          <w:p>
+            <w:pPr>
+              <w:spacing w:after="0" w:line="240" w:lineRule="auto"/>
+              <w:jc w:val="center"/>
+              <w:rPr>
+                <w:rFonts w:ascii="Calibri" w:eastAsia="Times New Roman" w:hAnsi="Calibri" w:cs="Calibri"/>
+                <w:b/>
+                <w:bCs/>
+                <w:color w:val="000000"/>
+                <w:lang w:eastAsia="es-CL"/>
+              </w:rPr>
+            </w:pPr>
+            <w:r>
+              <w:rPr>
+                <w:rFonts w:ascii="Calibri" w:eastAsia="Times New Roman" w:hAnsi="Calibri" w:cs="Calibri"/>
+                <w:b/>
+                <w:bCs/>
+                <w:color w:val="000000"/>
+                <w:lang w:eastAsia="es-CL"/>
+              </w:rPr>
+              <w:t> </w:t>
+            </w:r>
+          </w:p>
+        </w:tc>
+        <w:tc>
+          <w:tcPr>
+            <w:tcW w:w="1450" w:type="dxa"/>
             <w:tcBorders>
               <w:top w:val="nil"/>
               <w:left w:val="nil"/>
@@ -3201,127 +3262,18 @@
                 <w:color w:val="000000"/>
                 <w:lang w:eastAsia="es-CL"/>
               </w:rPr>
-              <w:t>4</w:t>
-            </w:r>
-            <w:r>
-              <w:rPr>
-                <w:rFonts w:ascii="Calibri" w:eastAsia="Times New Roman" w:hAnsi="Calibri" w:cs="Calibri"/>
-                <w:b/>
-                <w:bCs/>
-                <w:color w:val="000000"/>
-                <w:lang w:eastAsia="es-CL"/>
-              </w:rPr>
-              <w:br/>
-              <w:t>5</w:t>
-            </w:r>
-          </w:p>
-        </w:tc>
-        <w:tc>
-          <w:tcPr>
-            <w:tcW w:w="1020" w:type="dxa"/>
-            <w:tcBorders>
-              <w:top w:val="nil"/>
-              <w:left w:val="nil"/>
-              <w:bottom w:val="single" w:sz="4" w:space="0" w:color="auto"/>
-              <w:right w:val="single" w:sz="4" w:space="0" w:color="auto"/>
-            </w:tcBorders>
-            <w:shd w:val="clear" w:color="FFC7CE" w:fill="FFC7CE"/>
-            <w:vAlign w:val="center"/>
-            <w:hideMark/>
-          </w:tcPr>
-          <w:p>
-            <w:pPr>
-              <w:spacing w:after="0" w:line="240" w:lineRule="auto"/>
-              <w:jc w:val="center"/>
-              <w:rPr>
-                <w:rFonts w:ascii="Calibri" w:eastAsia="Times New Roman" w:hAnsi="Calibri" w:cs="Calibri"/>
-                <w:b/>
-                <w:bCs/>
-                <w:color w:val="000000"/>
-                <w:lang w:eastAsia="es-CL"/>
-              </w:rPr>
-            </w:pPr>
-            <w:r>
-              <w:rPr>
-                <w:rFonts w:ascii="Calibri" w:eastAsia="Times New Roman" w:hAnsi="Calibri" w:cs="Calibri"/>
-                <w:b/>
-                <w:bCs/>
-                <w:color w:val="000000"/>
-                <w:lang w:eastAsia="es-CL"/>
-              </w:rPr>
-              <w:t>1</w:t>
-            </w:r>
-          </w:p>
-          <w:p>
-            <w:pPr>
-              <w:spacing w:after="0" w:line="240" w:lineRule="auto"/>
-              <w:jc w:val="center"/>
-              <w:rPr>
-                <w:rFonts w:ascii="Calibri" w:eastAsia="Times New Roman" w:hAnsi="Calibri" w:cs="Calibri"/>
-                <w:b/>
-                <w:bCs/>
-                <w:color w:val="000000"/>
-                <w:lang w:eastAsia="es-CL"/>
-              </w:rPr>
-            </w:pPr>
-            <w:r>
-              <w:rPr>
-                <w:rFonts w:ascii="Calibri" w:eastAsia="Times New Roman" w:hAnsi="Calibri" w:cs="Calibri"/>
-                <w:b/>
-                <w:bCs/>
-                <w:color w:val="000000"/>
-                <w:lang w:eastAsia="es-CL"/>
-              </w:rPr>
-              <w:t>2</w:t>
-            </w:r>
-            <w:r>
-              <w:rPr>
-                <w:rFonts w:ascii="Calibri" w:eastAsia="Times New Roman" w:hAnsi="Calibri" w:cs="Calibri"/>
-                <w:b/>
-                <w:bCs/>
-                <w:color w:val="000000"/>
-                <w:lang w:eastAsia="es-CL"/>
-              </w:rPr>
-              <w:br/>
-              <w:t>7</w:t>
-            </w:r>
-          </w:p>
-        </w:tc>
-        <w:tc>
-          <w:tcPr>
-            <w:tcW w:w="1000" w:type="dxa"/>
-            <w:tcBorders>
-              <w:top w:val="nil"/>
-              <w:left w:val="nil"/>
-              <w:bottom w:val="single" w:sz="4" w:space="0" w:color="auto"/>
-              <w:right w:val="single" w:sz="4" w:space="0" w:color="auto"/>
-            </w:tcBorders>
-            <w:shd w:val="clear" w:color="FFC7CE" w:fill="FFC7CE"/>
-            <w:vAlign w:val="center"/>
-            <w:hideMark/>
-          </w:tcPr>
-          <w:p>
-            <w:pPr>
-              <w:spacing w:after="0" w:line="240" w:lineRule="auto"/>
-              <w:jc w:val="center"/>
-              <w:rPr>
-                <w:rFonts w:ascii="Calibri" w:eastAsia="Times New Roman" w:hAnsi="Calibri" w:cs="Calibri"/>
-                <w:b/>
-                <w:bCs/>
-                <w:color w:val="000000"/>
-                <w:lang w:eastAsia="es-CL"/>
-              </w:rPr>
-            </w:pPr>
+              <w:t> </w:t>
+            </w:r>
           </w:p>
         </w:tc>
       </w:tr>
       <w:tr>
         <w:trPr>
-          <w:trHeight w:val="288"/>
+          <w:trHeight w:val="389"/>
         </w:trPr>
         <w:tc>
           <w:tcPr>
-            <w:tcW w:w="547" w:type="dxa"/>
+            <w:tcW w:w="1043" w:type="dxa"/>
             <w:tcBorders>
               <w:top w:val="nil"/>
               <w:left w:val="nil"/>
@@ -3349,7 +3301,7 @@
         </w:tc>
         <w:tc>
           <w:tcPr>
-            <w:tcW w:w="980" w:type="dxa"/>
+            <w:tcW w:w="1869" w:type="dxa"/>
             <w:tcBorders>
               <w:top w:val="nil"/>
               <w:left w:val="nil"/>
@@ -3375,7 +3327,7 @@
         </w:tc>
         <w:tc>
           <w:tcPr>
-            <w:tcW w:w="3020" w:type="dxa"/>
+            <w:tcW w:w="1526" w:type="dxa"/>
             <w:tcBorders>
               <w:top w:val="nil"/>
               <w:left w:val="single" w:sz="4" w:space="0" w:color="auto"/>
@@ -3412,7 +3364,7 @@
         </w:tc>
         <w:tc>
           <w:tcPr>
-            <w:tcW w:w="1020" w:type="dxa"/>
+            <w:tcW w:w="1869" w:type="dxa"/>
             <w:tcBorders>
               <w:top w:val="nil"/>
               <w:left w:val="nil"/>
@@ -3449,7 +3401,7 @@
         </w:tc>
         <w:tc>
           <w:tcPr>
-            <w:tcW w:w="1000" w:type="dxa"/>
+            <w:tcW w:w="1450" w:type="dxa"/>
             <w:tcBorders>
               <w:top w:val="nil"/>
               <w:left w:val="nil"/>
@@ -3487,11 +3439,11 @@
       </w:tr>
       <w:tr>
         <w:trPr>
-          <w:trHeight w:val="420"/>
+          <w:trHeight w:val="567"/>
         </w:trPr>
         <w:tc>
           <w:tcPr>
-            <w:tcW w:w="547" w:type="dxa"/>
+            <w:tcW w:w="1043" w:type="dxa"/>
             <w:tcBorders>
               <w:top w:val="nil"/>
               <w:left w:val="nil"/>
@@ -3519,7 +3471,7 @@
         </w:tc>
         <w:tc>
           <w:tcPr>
-            <w:tcW w:w="980" w:type="dxa"/>
+            <w:tcW w:w="1869" w:type="dxa"/>
             <w:tcBorders>
               <w:top w:val="nil"/>
               <w:left w:val="nil"/>
@@ -3545,7 +3497,7 @@
         </w:tc>
         <w:tc>
           <w:tcPr>
-            <w:tcW w:w="5040" w:type="dxa"/>
+            <w:tcW w:w="4846" w:type="dxa"/>
             <w:gridSpan w:val="3"/>
             <w:tcBorders>
               <w:top w:val="single" w:sz="4" w:space="0" w:color="auto"/>
@@ -3581,13 +3533,16 @@
                 <w:szCs w:val="32"/>
                 <w:lang w:eastAsia="es-CL"/>
               </w:rPr>
-              <w:t>Frecuencia</w:t>
+              <w:t>Probabilidad</w:t>
             </w:r>
           </w:p>
         </w:tc>
       </w:tr>
     </w:tbl>
-    <w:p/>
+    <w:p>
+      <w:bookmarkStart w:id="0" w:name="_GoBack"/>
+      <w:bookmarkEnd w:id="0"/>
+    </w:p>
     <w:sectPr>
       <w:pgSz w:w="12240" w:h="15840"/>
       <w:pgMar w:top="1417" w:right="1701" w:bottom="1417" w:left="1701" w:header="708" w:footer="708" w:gutter="0"/>

</xml_diff>